<commit_message>
feat(render): library briefs render in every format with their own sources; no empty industry heading (plan #235 step 9) (#235)
Co-Authored-By: Claude Opus 5.5 <noreply@anthropic.com>
Claude-Session: https://claude.ai/code/session_01MPRoCfbJuTDz6tit2f4eFM
</commit_message>
<xml_diff>
--- a/brand/case_study.docx
+++ b/brand/case_study.docx
@@ -248,6 +248,11 @@
       </w:r>
     </w:p>
     <w:p>
+      <w:r>
+        <w:t>{%p if industry.show_head %}</w:t>
+      </w:r>
+    </w:p>
+    <w:p>
       <w:pPr>
         <w:pStyle w:val="Heading1"/>
         <w:pageBreakBefore w:val="0"/>
@@ -343,6 +348,11 @@
     </w:p>
     <w:p>
       <w:r>
+        <w:t>{%p endif %}</w:t>
+      </w:r>
+    </w:p>
+    <w:p>
+      <w:r>
         <w:t>{%p if industry.note %}</w:t>
       </w:r>
     </w:p>
@@ -354,6 +364,122 @@
     <w:p>
       <w:r>
         <w:t>{%p endif %}</w:t>
+      </w:r>
+    </w:p>
+    <w:p>
+      <w:r>
+        <w:t>{%p for b in industry.briefs %}</w:t>
+      </w:r>
+    </w:p>
+    <w:p>
+      <w:pPr>
+        <w:pStyle w:val="Heading1"/>
+        <w:pageBreakBefore w:val="0"/>
+      </w:pPr>
+      <w:r>
+        <w:t>{{ b.title }}</w:t>
+      </w:r>
+    </w:p>
+    <w:p>
+      <w:r>
+        <w:rPr>
+          <w:i/>
+        </w:rPr>
+        <w:t>{{ b.disclaimer }}</w:t>
+      </w:r>
+    </w:p>
+    <w:p>
+      <w:r>
+        <w:t>{%p for t in b.takeaways %}</w:t>
+      </w:r>
+    </w:p>
+    <w:p>
+      <w:pPr>
+        <w:pStyle w:val="ListBullet"/>
+      </w:pPr>
+      <w:r>
+        <w:t>{{ t }}</w:t>
+      </w:r>
+    </w:p>
+    <w:p>
+      <w:r>
+        <w:t>{%p endfor %}</w:t>
+      </w:r>
+    </w:p>
+    <w:p>
+      <w:r>
+        <w:t>{%p for t in b.themes %}</w:t>
+      </w:r>
+    </w:p>
+    <w:p>
+      <w:pPr>
+        <w:pStyle w:val="Heading2"/>
+      </w:pPr>
+      <w:r>
+        <w:t>{{ t.heading }}</w:t>
+      </w:r>
+    </w:p>
+    <w:p>
+      <w:r>
+        <w:t>{{ t.text }}</w:t>
+      </w:r>
+    </w:p>
+    <w:p>
+      <w:r>
+        <w:t>{%p endfor %}</w:t>
+      </w:r>
+    </w:p>
+    <w:p>
+      <w:r>
+        <w:t>{%p if b.sources %}</w:t>
+      </w:r>
+    </w:p>
+    <w:p>
+      <w:pPr>
+        <w:pStyle w:val="Heading2"/>
+      </w:pPr>
+      <w:r>
+        <w:t>Sources</w:t>
+      </w:r>
+    </w:p>
+    <w:p>
+      <w:r>
+        <w:t>{%p for s in b.sources %}</w:t>
+      </w:r>
+    </w:p>
+    <w:p>
+      <w:r>
+        <w:t>[{{ s.n }}] {{ s.title }}, {{ s.publisher }}, {{ s.url }}, retrieved {{ s.date }}</w:t>
+      </w:r>
+    </w:p>
+    <w:p>
+      <w:r>
+        <w:t>{%p endfor %}</w:t>
+      </w:r>
+    </w:p>
+    <w:p>
+      <w:r>
+        <w:t>{%p endif %}</w:t>
+      </w:r>
+    </w:p>
+    <w:p>
+      <w:r>
+        <w:t>{%p if b.note %}</w:t>
+      </w:r>
+    </w:p>
+    <w:p>
+      <w:r>
+        <w:t>{{ b.note }}</w:t>
+      </w:r>
+    </w:p>
+    <w:p>
+      <w:r>
+        <w:t>{%p endif %}</w:t>
+      </w:r>
+    </w:p>
+    <w:p>
+      <w:r>
+        <w:t>{%p endfor %}</w:t>
       </w:r>
     </w:p>
     <w:p>

</xml_diff>

<commit_message>
feat(render): solution architecture in docx, pptx (native shapes), md (Mermaid) and the preview (SVG), protected like all case text; diagrams scale to fit, zones aligned (plan #246 step A5) (#246)
Co-Authored-By: Claude Opus 5.5 <noreply@anthropic.com>
Claude-Session: https://claude.ai/code/session_01MPRoCfbJuTDz6tit2f4eFM
</commit_message>
<xml_diff>
--- a/brand/case_study.docx
+++ b/brand/case_study.docx
@@ -147,6 +147,29 @@
     </w:p>
     <w:p>
       <w:r>
+        <w:t>{%p if c.arch_image %}</w:t>
+      </w:r>
+    </w:p>
+    <w:p>
+      <w:pPr>
+        <w:pStyle w:val="Heading1"/>
+      </w:pPr>
+      <w:r>
+        <w:t>Architecture</w:t>
+      </w:r>
+    </w:p>
+    <w:p>
+      <w:r>
+        <w:t>{{ c.arch_image }}</w:t>
+      </w:r>
+    </w:p>
+    <w:p>
+      <w:r>
+        <w:t>{%p endif %}</w:t>
+      </w:r>
+    </w:p>
+    <w:p>
+      <w:r>
         <w:t>{%p if c.diagrams %}</w:t>
       </w:r>
     </w:p>
@@ -155,7 +178,7 @@
         <w:pStyle w:val="Heading1"/>
       </w:pPr>
       <w:r>
-        <w:t>Architecture</w:t>
+        <w:t>Diagrams</w:t>
       </w:r>
     </w:p>
     <w:p>

</xml_diff>

<commit_message>
feat(logos): logos in bid pack, case study and slides, preview and search cards, one SQL display rule (plan #267 step 4) (#267)
Co-Authored-By: Claude Opus 5.5 <noreply@anthropic.com>
Claude-Session: https://claude.ai/code/session_01MPRoCfbJuTDz6tit2f4eFM
</commit_message>
<xml_diff>
--- a/brand/case_study.docx
+++ b/brand/case_study.docx
@@ -5,6 +5,24 @@
     <w:p>
       <w:r>
         <w:t>{%p for c in cases %}</w:t>
+      </w:r>
+    </w:p>
+    <w:p>
+      <w:r>
+        <w:t>{%p if c.logo %}</w:t>
+      </w:r>
+    </w:p>
+    <w:p>
+      <w:pPr>
+        <w:jc w:val="right"/>
+      </w:pPr>
+      <w:r>
+        <w:t>{{ c.logo }}</w:t>
+      </w:r>
+    </w:p>
+    <w:p>
+      <w:r>
+        <w:t>{%p endif %}</w:t>
       </w:r>
     </w:p>
     <w:p>

</xml_diff>

<commit_message>
fix(brand): the case study's first page shows the wordmark once, in its blue band (plan #282 step C) (#282)
Co-Authored-By: Claude Opus 5.5 <noreply@anthropic.com>
Claude-Session: https://claude.ai/code/session_01MPRoCfbJuTDz6tit2f4eFM
</commit_message>
<xml_diff>
--- a/brand/case_study.docx
+++ b/brand/case_study.docx
@@ -77,7 +77,7 @@
                           <pic:cNvPicPr/>
                         </pic:nvPicPr>
                         <pic:blipFill>
-                          <a:blip r:embed="rId11"/>
+                          <a:blip r:embed="rId12"/>
                           <a:stretch>
                             <a:fillRect/>
                           </a:stretch>
@@ -787,9 +787,11 @@
     <w:sectPr>
       <w:headerReference w:type="default" r:id="rId9"/>
       <w:footerReference w:type="default" r:id="rId10"/>
+      <w:footerReference w:type="first" r:id="rId11"/>
       <w:pgSz w:w="12240" w:h="15840"/>
       <w:pgMar w:top="1440" w:right="1800" w:bottom="1440" w:left="1800" w:header="720" w:footer="720" w:gutter="0"/>
       <w:cols w:space="720"/>
+      <w:titlePg/>
       <w:docGrid w:linePitch="360"/>
     </w:sectPr>
   </w:body>
@@ -797,6 +799,58 @@
 </file>
 
 <file path=word/footer1.xml><?xml version="1.0" encoding="utf-8"?>
+<w:ftr xmlns:m="http://schemas.openxmlformats.org/officeDocument/2006/math" xmlns:mc="http://schemas.openxmlformats.org/markup-compatibility/2006" xmlns:mo="http://schemas.microsoft.com/office/mac/office/2008/main" xmlns:mv="urn:schemas-microsoft-com:mac:vml" xmlns:o="urn:schemas-microsoft-com:office:office" xmlns:r="http://schemas.openxmlformats.org/officeDocument/2006/relationships" xmlns:v="urn:schemas-microsoft-com:vml" xmlns:w10="urn:schemas-microsoft-com:office:word" xmlns:w14="http://schemas.microsoft.com/office/word/2010/wordml" xmlns:w="http://schemas.openxmlformats.org/wordprocessingml/2006/main" xmlns:wne="http://schemas.microsoft.com/office/word/2006/wordml" xmlns:wp14="http://schemas.microsoft.com/office/word/2010/wordprocessingDrawing" xmlns:wp="http://schemas.openxmlformats.org/drawingml/2006/wordprocessingDrawing" xmlns:wpc="http://schemas.microsoft.com/office/word/2010/wordprocessingCanvas" xmlns:wpg="http://schemas.microsoft.com/office/word/2010/wordprocessingGroup" xmlns:wpi="http://schemas.microsoft.com/office/word/2010/wordprocessingInk" xmlns:wps="http://schemas.microsoft.com/office/word/2010/wordprocessingShape" mc:Ignorable="w14 wp14">
+  <w:p>
+    <w:pPr>
+      <w:pStyle w:val="Footer"/>
+      <w:jc w:val="left"/>
+    </w:pPr>
+    <w:r>
+      <w:rPr>
+        <w:rFonts w:ascii="Aptos" w:hAnsi="Aptos"/>
+        <w:color w:val="808285"/>
+        <w:sz w:val="16"/>
+      </w:rPr>
+      <w:t>Synechron · Confidential</w:t>
+      <w:tab/>
+    </w:r>
+    <w:r>
+      <w:rPr>
+        <w:rFonts w:ascii="Aptos" w:hAnsi="Aptos" w:cs="Aptos" w:eastAsia="Aptos"/>
+        <w:color w:val="808285"/>
+        <w:sz w:val="16"/>
+      </w:rPr>
+      <w:fldChar w:fldCharType="begin"/>
+    </w:r>
+    <w:r>
+      <w:rPr>
+        <w:rFonts w:ascii="Aptos" w:hAnsi="Aptos" w:cs="Aptos" w:eastAsia="Aptos"/>
+        <w:color w:val="808285"/>
+        <w:sz w:val="16"/>
+      </w:rPr>
+      <w:instrText xml:space="preserve"> PAGE </w:instrText>
+    </w:r>
+    <w:r>
+      <w:rPr>
+        <w:rFonts w:ascii="Aptos" w:hAnsi="Aptos" w:cs="Aptos" w:eastAsia="Aptos"/>
+        <w:color w:val="808285"/>
+        <w:sz w:val="16"/>
+      </w:rPr>
+      <w:fldChar w:fldCharType="separate"/>
+    </w:r>
+    <w:r>
+      <w:rPr>
+        <w:rFonts w:ascii="Aptos" w:hAnsi="Aptos" w:cs="Aptos" w:eastAsia="Aptos"/>
+        <w:color w:val="808285"/>
+        <w:sz w:val="16"/>
+      </w:rPr>
+      <w:fldChar w:fldCharType="end"/>
+    </w:r>
+  </w:p>
+</w:ftr>
+</file>
+
+<file path=word/footer2.xml><?xml version="1.0" encoding="utf-8"?>
 <w:ftr xmlns:m="http://schemas.openxmlformats.org/officeDocument/2006/math" xmlns:mc="http://schemas.openxmlformats.org/markup-compatibility/2006" xmlns:mo="http://schemas.microsoft.com/office/mac/office/2008/main" xmlns:mv="urn:schemas-microsoft-com:mac:vml" xmlns:o="urn:schemas-microsoft-com:office:office" xmlns:r="http://schemas.openxmlformats.org/officeDocument/2006/relationships" xmlns:v="urn:schemas-microsoft-com:vml" xmlns:w10="urn:schemas-microsoft-com:office:word" xmlns:w14="http://schemas.microsoft.com/office/word/2010/wordml" xmlns:w="http://schemas.openxmlformats.org/wordprocessingml/2006/main" xmlns:wne="http://schemas.microsoft.com/office/word/2006/wordml" xmlns:wp14="http://schemas.microsoft.com/office/word/2010/wordprocessingDrawing" xmlns:wp="http://schemas.openxmlformats.org/drawingml/2006/wordprocessingDrawing" xmlns:wpc="http://schemas.microsoft.com/office/word/2010/wordprocessingCanvas" xmlns:wpg="http://schemas.microsoft.com/office/word/2010/wordprocessingGroup" xmlns:wpi="http://schemas.microsoft.com/office/word/2010/wordprocessingInk" xmlns:wps="http://schemas.microsoft.com/office/word/2010/wordprocessingShape" mc:Ignorable="w14 wp14">
   <w:p>
     <w:pPr>

</xml_diff>